<commit_message>
feat: improve QR scanning and Word export
</commit_message>
<xml_diff>
--- a/assets/templates/word/business_registration/3. Danh sách chủ sở hữu hưởng lợi.docx
+++ b/assets/templates/word/business_registration/3. Danh sách chủ sở hữu hưởng lợi.docx
@@ -923,11 +923,11 @@
                 <w:szCs w:val="25"/>
               </w:rPr>
             </w:pPr>
-            <w:bookmarkStart w:id="31000" w:name="MINGO_FIELD_0"/>
-            <w:r>
-              <w:t xml:space="preserve">THOMAS EDITON</w:t>
-            </w:r>
-            <w:bookmarkEnd w:id="31000"/>
+            <w:bookmarkStart w:id="0" w:name="MINGO_FIELD_0"/>
+            <w:r>
+              <w:t>THOMAS EDITON</w:t>
+            </w:r>
+            <w:bookmarkEnd w:id="0"/>
           </w:p>
         </w:tc>
         <w:tc>
@@ -944,11 +944,11 @@
                 <w:highlight w:val="yellow"/>
               </w:rPr>
             </w:pPr>
-            <w:bookmarkStart w:id="31001" w:name="MINGO_FIELD_1"/>
-            <w:r>
-              <w:t xml:space="preserve">11/11/1111</w:t>
-            </w:r>
-            <w:bookmarkEnd w:id="31001"/>
+            <w:bookmarkStart w:id="1" w:name="MINGO_FIELD_1"/>
+            <w:r>
+              <w:t>11/11/1111</w:t>
+            </w:r>
+            <w:bookmarkEnd w:id="1"/>
           </w:p>
         </w:tc>
         <w:tc>
@@ -966,11 +966,11 @@
                 <w:lang w:val="en-US"/>
               </w:rPr>
             </w:pPr>
-            <w:bookmarkStart w:id="31002" w:name="MINGO_FIELD_2"/>
-            <w:r>
-              <w:t xml:space="preserve">Nữ</w:t>
-            </w:r>
-            <w:bookmarkEnd w:id="31002"/>
+            <w:bookmarkStart w:id="2" w:name="MINGO_FIELD_2"/>
+            <w:r>
+              <w:t>Nữ</w:t>
+            </w:r>
+            <w:bookmarkEnd w:id="2"/>
           </w:p>
         </w:tc>
         <w:tc>
@@ -1036,11 +1036,11 @@
             <w:r>
               <w:t xml:space="preserve">Ngày cấp: </w:t>
             </w:r>
-            <w:bookmarkStart w:id="31003" w:name="MINGO_FIELD_3"/>
-            <w:r>
-              <w:t xml:space="preserve">27/01/2026</w:t>
-            </w:r>
-            <w:bookmarkEnd w:id="31003"/>
+            <w:bookmarkStart w:id="3" w:name="MINGO_FIELD_3"/>
+            <w:r>
+              <w:t>27/01/2026</w:t>
+            </w:r>
+            <w:bookmarkEnd w:id="3"/>
           </w:p>
           <w:p>
             <w:pPr>
@@ -1084,47 +1084,8 @@
                 <w:rFonts w:ascii="Times New Roman" w:hAnsi="Times New Roman" w:cs="Times New Roman"/>
                 <w:sz w:val="25"/>
                 <w:szCs w:val="25"/>
-                <w:highlight w:val="yellow"/>
-              </w:rPr>
-              <w:t>Bộ</w:t>
-            </w:r>
-            <w:r>
-              <w:rPr>
-                <w:rStyle w:val="cf01"/>
-                <w:rFonts w:ascii="Times New Roman" w:hAnsi="Times New Roman" w:cs="Times New Roman"/>
-                <w:sz w:val="25"/>
-                <w:szCs w:val="25"/>
-              </w:rPr>
-              <w:t xml:space="preserve"> </w:t>
-            </w:r>
-            <w:r>
-              <w:rPr>
-                <w:rStyle w:val="cf01"/>
-                <w:rFonts w:ascii="Times New Roman" w:hAnsi="Times New Roman" w:cs="Times New Roman"/>
-                <w:sz w:val="25"/>
-                <w:szCs w:val="25"/>
-                <w:highlight w:val="yellow"/>
-              </w:rPr>
-              <w:t>Công</w:t>
-            </w:r>
-            <w:r>
-              <w:rPr>
-                <w:rStyle w:val="cf01"/>
-                <w:rFonts w:ascii="Times New Roman" w:hAnsi="Times New Roman" w:cs="Times New Roman"/>
-                <w:sz w:val="25"/>
-                <w:szCs w:val="25"/>
-              </w:rPr>
-              <w:t xml:space="preserve"> </w:t>
-            </w:r>
-            <w:r>
-              <w:rPr>
-                <w:rStyle w:val="cf01"/>
-                <w:rFonts w:ascii="Times New Roman" w:hAnsi="Times New Roman" w:cs="Times New Roman"/>
-                <w:sz w:val="25"/>
-                <w:szCs w:val="25"/>
-                <w:highlight w:val="yellow"/>
-              </w:rPr>
-              <w:t>An</w:t>
+              </w:rPr>
+              <w:t>Bộ Công An</w:t>
             </w:r>
           </w:p>
         </w:tc>
@@ -1174,11 +1135,11 @@
                 <w:szCs w:val="25"/>
               </w:rPr>
             </w:pPr>
-            <w:bookmarkStart w:id="31004" w:name="MINGO_FIELD_4"/>
-            <w:r>
-              <w:t xml:space="preserve">Thôn Hai, Xã Ba, Tỉnh Bốn Năm</w:t>
-            </w:r>
-            <w:bookmarkEnd w:id="31004"/>
+            <w:bookmarkStart w:id="4" w:name="MINGO_FIELD_4"/>
+            <w:r>
+              <w:t>Thôn Hai, Xã Ba, Tỉnh Bốn Năm</w:t>
+            </w:r>
+            <w:bookmarkEnd w:id="4"/>
           </w:p>
         </w:tc>
         <w:tc>
@@ -1284,35 +1245,59 @@
                 <w:lang w:val="vi-VN"/>
               </w:rPr>
             </w:pPr>
-            <w:bookmarkStart w:id="31005" w:name="MINGO_FIELD_5"/>
-            <w:r>
-              <w:t xml:space="preserve">Tây Ninh</w:t>
-            </w:r>
-            <w:bookmarkEnd w:id="31005"/>
-            <w:r>
-              <w:t xml:space="preserve">, ngày </w:t>
-            </w:r>
-            <w:bookmarkStart w:id="31006" w:name="MINGO_FIELD_6"/>
-            <w:r>
-              <w:t xml:space="preserve">23</w:t>
-            </w:r>
-            <w:bookmarkEnd w:id="31006"/>
-            <w:r>
-              <w:t xml:space="preserve"> tháng </w:t>
-            </w:r>
-            <w:bookmarkStart w:id="31007" w:name="MINGO_FIELD_7"/>
-            <w:r>
-              <w:t xml:space="preserve">03</w:t>
-            </w:r>
-            <w:bookmarkEnd w:id="31007"/>
-            <w:r>
-              <w:t xml:space="preserve"> năm </w:t>
-            </w:r>
-            <w:bookmarkStart w:id="31008" w:name="MINGO_FIELD_8"/>
-            <w:r>
-              <w:t xml:space="preserve">2026</w:t>
-            </w:r>
-            <w:bookmarkEnd w:id="31008"/>
+            <w:bookmarkStart w:id="5" w:name="MINGO_FIELD_5"/>
+            <w:r>
+              <w:t>Tây Ninh</w:t>
+            </w:r>
+            <w:bookmarkEnd w:id="5"/>
+            <w:r>
+              <w:t xml:space="preserve">, </w:t>
+            </w:r>
+            <w:proofErr w:type="spellStart"/>
+            <w:r>
+              <w:t>ngày</w:t>
+            </w:r>
+            <w:proofErr w:type="spellEnd"/>
+            <w:r>
+              <w:t xml:space="preserve"> </w:t>
+            </w:r>
+            <w:bookmarkStart w:id="6" w:name="MINGO_FIELD_6"/>
+            <w:r>
+              <w:t>23</w:t>
+            </w:r>
+            <w:bookmarkEnd w:id="6"/>
+            <w:r>
+              <w:t xml:space="preserve"> </w:t>
+            </w:r>
+            <w:proofErr w:type="spellStart"/>
+            <w:r>
+              <w:t>tháng</w:t>
+            </w:r>
+            <w:proofErr w:type="spellEnd"/>
+            <w:r>
+              <w:t xml:space="preserve"> </w:t>
+            </w:r>
+            <w:bookmarkStart w:id="7" w:name="MINGO_FIELD_7"/>
+            <w:r>
+              <w:t>03</w:t>
+            </w:r>
+            <w:bookmarkEnd w:id="7"/>
+            <w:r>
+              <w:t xml:space="preserve"> </w:t>
+            </w:r>
+            <w:proofErr w:type="spellStart"/>
+            <w:r>
+              <w:t>năm</w:t>
+            </w:r>
+            <w:proofErr w:type="spellEnd"/>
+            <w:r>
+              <w:t xml:space="preserve"> </w:t>
+            </w:r>
+            <w:bookmarkStart w:id="8" w:name="MINGO_FIELD_8"/>
+            <w:r>
+              <w:t>2026</w:t>
+            </w:r>
+            <w:bookmarkEnd w:id="8"/>
           </w:p>
           <w:p>
             <w:pPr>
@@ -1323,6 +1308,7 @@
                 <w:iCs/>
                 <w:sz w:val="26"/>
                 <w:szCs w:val="26"/>
+                <w:lang w:val="vi-VN"/>
               </w:rPr>
             </w:pPr>
             <w:r>
@@ -1332,6 +1318,7 @@
                 <w:iCs/>
                 <w:sz w:val="26"/>
                 <w:szCs w:val="26"/>
+                <w:lang w:val="vi-VN"/>
               </w:rPr>
               <w:t>NGƯỜI ĐẠI DIỆN THEO PHÁP LUẬT</w:t>
             </w:r>
@@ -1343,6 +1330,7 @@
                 <w:iCs/>
                 <w:sz w:val="26"/>
                 <w:szCs w:val="26"/>
+                <w:lang w:val="vi-VN"/>
               </w:rPr>
               <w:t>/</w:t>
             </w:r>
@@ -1354,6 +1342,7 @@
                 <w:iCs/>
                 <w:sz w:val="26"/>
                 <w:szCs w:val="26"/>
+                <w:lang w:val="vi-VN"/>
               </w:rPr>
               <w:br/>
               <w:t>CHỦ TỊCH HỘI ĐỒNG THÀNH VIÊN/</w:t>
@@ -1366,6 +1355,7 @@
                 <w:iCs/>
                 <w:sz w:val="26"/>
                 <w:szCs w:val="26"/>
+                <w:lang w:val="vi-VN"/>
               </w:rPr>
               <w:br/>
               <w:t>CHỦ TỊCH HỘI ĐỒNG QUẢN TRỊ</w:t>
@@ -1377,6 +1367,7 @@
                 <w:iCs/>
                 <w:sz w:val="26"/>
                 <w:szCs w:val="26"/>
+                <w:lang w:val="vi-VN"/>
               </w:rPr>
               <w:t xml:space="preserve"> CỦA CÔNG TY</w:t>
             </w:r>
@@ -1390,6 +1381,7 @@
                 <w:iCs/>
                 <w:sz w:val="26"/>
                 <w:szCs w:val="26"/>
+                <w:lang w:val="vi-VN"/>
               </w:rPr>
             </w:pPr>
           </w:p>
@@ -1402,6 +1394,7 @@
                 <w:iCs/>
                 <w:sz w:val="26"/>
                 <w:szCs w:val="26"/>
+                <w:lang w:val="vi-VN"/>
               </w:rPr>
             </w:pPr>
           </w:p>
@@ -1414,6 +1407,7 @@
                 <w:iCs/>
                 <w:sz w:val="26"/>
                 <w:szCs w:val="26"/>
+                <w:lang w:val="vi-VN"/>
               </w:rPr>
             </w:pPr>
           </w:p>
@@ -1426,6 +1420,7 @@
                 <w:iCs/>
                 <w:sz w:val="26"/>
                 <w:szCs w:val="26"/>
+                <w:lang w:val="vi-VN"/>
               </w:rPr>
             </w:pPr>
           </w:p>
@@ -1438,6 +1433,7 @@
                 <w:iCs/>
                 <w:sz w:val="26"/>
                 <w:szCs w:val="26"/>
+                <w:lang w:val="vi-VN"/>
               </w:rPr>
             </w:pPr>
           </w:p>
@@ -1450,6 +1446,7 @@
                 <w:iCs/>
                 <w:sz w:val="26"/>
                 <w:szCs w:val="26"/>
+                <w:lang w:val="vi-VN"/>
               </w:rPr>
             </w:pPr>
           </w:p>
@@ -1471,7 +1468,6 @@
                 <w:color w:val="000000" w:themeColor="text1"/>
                 <w:sz w:val="26"/>
                 <w:szCs w:val="26"/>
-                <w:highlight w:val="yellow"/>
                 <w:lang w:eastAsia="zh-CN"/>
               </w:rPr>
               <w:t>THOMAS</w:t>
@@ -1486,20 +1482,7 @@
                 <w:szCs w:val="26"/>
                 <w:lang w:val="vi-VN" w:eastAsia="zh-CN"/>
               </w:rPr>
-              <w:t xml:space="preserve"> </w:t>
-            </w:r>
-            <w:r>
-              <w:rPr>
-                <w:rFonts w:eastAsia="Times New Roman"/>
-                <w:b/>
-                <w:bCs/>
-                <w:color w:val="000000" w:themeColor="text1"/>
-                <w:sz w:val="26"/>
-                <w:szCs w:val="26"/>
-                <w:highlight w:val="yellow"/>
-                <w:lang w:val="vi-VN" w:eastAsia="zh-CN"/>
-              </w:rPr>
-              <w:t>EDITON</w:t>
+              <w:t xml:space="preserve"> EDITON</w:t>
             </w:r>
           </w:p>
         </w:tc>

</xml_diff>